<commit_message>
Add header component and update images
Introduces a reusable header in html/parts/header.php and updates index.php to use it. Adds new image assets for UI elements and updates logo.png. Implements a basic login form in login.php.
</commit_message>
<xml_diff>
--- a/devlog.docx
+++ b/devlog.docx
@@ -40,12 +40,10 @@
         </w:numPr>
       </w:pPr>
       <w:proofErr w:type="spellStart"/>
-      <w:proofErr w:type="gramStart"/>
       <w:r>
         <w:t>userId</w:t>
       </w:r>
       <w:proofErr w:type="spellEnd"/>
-      <w:proofErr w:type="gramEnd"/>
       <w:r>
         <w:t xml:space="preserve"> (voor een specifiek iets wat we later kunnen aanroepen aangezien namen en </w:t>
       </w:r>
@@ -67,12 +65,10 @@
         </w:numPr>
       </w:pPr>
       <w:proofErr w:type="spellStart"/>
-      <w:proofErr w:type="gramStart"/>
       <w:r>
         <w:t>firstName</w:t>
       </w:r>
       <w:proofErr w:type="spellEnd"/>
-      <w:proofErr w:type="gramEnd"/>
       <w:r>
         <w:t xml:space="preserve"> (om de persoon aan te roepen in de website bijv. welkom {</w:t>
       </w:r>
@@ -94,17 +90,12 @@
         </w:numPr>
       </w:pPr>
       <w:proofErr w:type="spellStart"/>
-      <w:proofErr w:type="gramStart"/>
       <w:r>
         <w:t>lastName</w:t>
       </w:r>
       <w:proofErr w:type="spellEnd"/>
-      <w:proofErr w:type="gramEnd"/>
-      <w:r>
-        <w:t xml:space="preserve"> </w:t>
-      </w:r>
-      <w:r>
-        <w:t>(om de persoon aan te roepen in de website bijv. welkom {</w:t>
+      <w:r>
+        <w:t xml:space="preserve"> (om de persoon aan te roepen in de website bijv. welkom {</w:t>
       </w:r>
       <w:proofErr w:type="spellStart"/>
       <w:r>
@@ -131,13 +122,8 @@
           <w:numId w:val="1"/>
         </w:numPr>
       </w:pPr>
-      <w:proofErr w:type="gramStart"/>
-      <w:r>
-        <w:t>email</w:t>
-      </w:r>
-      <w:proofErr w:type="gramEnd"/>
-      <w:r>
-        <w:t xml:space="preserve"> (voor mails naar de persoon)</w:t>
+      <w:r>
+        <w:t>email (voor mails naar de persoon)</w:t>
       </w:r>
     </w:p>
     <w:p>
@@ -148,13 +134,8 @@
           <w:numId w:val="1"/>
         </w:numPr>
       </w:pPr>
-      <w:proofErr w:type="gramStart"/>
-      <w:r>
-        <w:t>postcode</w:t>
-      </w:r>
-      <w:proofErr w:type="gramEnd"/>
-      <w:r>
-        <w:t xml:space="preserve"> (</w:t>
+      <w:r>
+        <w:t>postcode (</w:t>
       </w:r>
       <w:r>
         <w:t>voor het bezorgen van brieven en of boeken)</w:t>
@@ -175,12 +156,10 @@
         </w:numPr>
       </w:pPr>
       <w:proofErr w:type="spellStart"/>
-      <w:proofErr w:type="gramStart"/>
       <w:r>
         <w:t>boekId</w:t>
       </w:r>
       <w:proofErr w:type="spellEnd"/>
-      <w:proofErr w:type="gramEnd"/>
       <w:r>
         <w:t xml:space="preserve"> (het aanroepen van een specifiek boek binnen de voorraad)</w:t>
       </w:r>
@@ -194,12 +173,10 @@
         </w:numPr>
       </w:pPr>
       <w:proofErr w:type="spellStart"/>
-      <w:proofErr w:type="gramStart"/>
       <w:r>
         <w:t>isbn</w:t>
       </w:r>
       <w:proofErr w:type="spellEnd"/>
-      <w:proofErr w:type="gramEnd"/>
       <w:r>
         <w:t xml:space="preserve"> (specifiek boek ID die globaal bekend is, dit voor de zoekfunctie)</w:t>
       </w:r>
@@ -213,12 +190,10 @@
         </w:numPr>
       </w:pPr>
       <w:proofErr w:type="spellStart"/>
-      <w:proofErr w:type="gramStart"/>
       <w:r>
         <w:t>title</w:t>
       </w:r>
       <w:proofErr w:type="spellEnd"/>
-      <w:proofErr w:type="gramEnd"/>
       <w:r>
         <w:t xml:space="preserve"> (titel van het boek)</w:t>
       </w:r>
@@ -232,12 +207,10 @@
         </w:numPr>
       </w:pPr>
       <w:proofErr w:type="spellStart"/>
-      <w:proofErr w:type="gramStart"/>
       <w:r>
         <w:t>desc</w:t>
       </w:r>
       <w:proofErr w:type="spellEnd"/>
-      <w:proofErr w:type="gramEnd"/>
       <w:r>
         <w:t xml:space="preserve"> (beschrijving van het boek)</w:t>
       </w:r>
@@ -251,12 +224,10 @@
         </w:numPr>
       </w:pPr>
       <w:proofErr w:type="spellStart"/>
-      <w:proofErr w:type="gramStart"/>
       <w:r>
         <w:t>amount</w:t>
       </w:r>
       <w:proofErr w:type="spellEnd"/>
-      <w:proofErr w:type="gramEnd"/>
       <w:r>
         <w:t xml:space="preserve"> (om voorraad bij te houden)</w:t>
       </w:r>
@@ -276,12 +247,10 @@
         </w:numPr>
       </w:pPr>
       <w:proofErr w:type="spellStart"/>
-      <w:proofErr w:type="gramStart"/>
       <w:r>
         <w:t>reservationId</w:t>
       </w:r>
       <w:proofErr w:type="spellEnd"/>
-      <w:proofErr w:type="gramEnd"/>
       <w:r>
         <w:t xml:space="preserve"> (voor het consistent aan kunnen roepen van de reservering)</w:t>
       </w:r>
@@ -295,12 +264,10 @@
         </w:numPr>
       </w:pPr>
       <w:proofErr w:type="spellStart"/>
-      <w:proofErr w:type="gramStart"/>
       <w:r>
         <w:t>purchaseDate</w:t>
       </w:r>
       <w:proofErr w:type="spellEnd"/>
-      <w:proofErr w:type="gramEnd"/>
       <w:r>
         <w:t xml:space="preserve"> (voor het bijhouden van leendatum zodat de retourdatum uitgerekend kan worden)</w:t>
       </w:r>
@@ -314,14 +281,82 @@
         </w:numPr>
       </w:pPr>
       <w:proofErr w:type="spellStart"/>
-      <w:proofErr w:type="gramStart"/>
       <w:r>
         <w:t>returnDate</w:t>
       </w:r>
       <w:proofErr w:type="spellEnd"/>
-      <w:proofErr w:type="gramEnd"/>
       <w:r>
         <w:t xml:space="preserve"> (voor het bijhouden van de retourdatum</w:t>
+      </w:r>
+    </w:p>
+    <w:p>
+      <w:r>
+        <w:rPr>
+          <w:b/>
+          <w:bCs/>
+        </w:rPr>
+        <w:t xml:space="preserve">Train of </w:t>
+      </w:r>
+      <w:proofErr w:type="spellStart"/>
+      <w:r>
+        <w:rPr>
+          <w:b/>
+          <w:bCs/>
+        </w:rPr>
+        <w:t>thought</w:t>
+      </w:r>
+      <w:proofErr w:type="spellEnd"/>
+      <w:r>
+        <w:rPr>
+          <w:b/>
+          <w:bCs/>
+        </w:rPr>
+        <w:t>:</w:t>
+      </w:r>
+    </w:p>
+    <w:p>
+      <w:r>
+        <w:t xml:space="preserve">Om te beginnen met de website zal ik de </w:t>
+      </w:r>
+      <w:proofErr w:type="spellStart"/>
+      <w:r>
+        <w:t>volgede</w:t>
+      </w:r>
+      <w:proofErr w:type="spellEnd"/>
+      <w:r>
+        <w:t xml:space="preserve"> dingen nodig hebben: Een design, een kleuren palette, </w:t>
+      </w:r>
+      <w:r>
+        <w:t xml:space="preserve">Kennis over databases (die ik nog niet heb). Ik zal beginnen met het design en op basis van de </w:t>
+      </w:r>
+      <w:proofErr w:type="spellStart"/>
+      <w:r>
+        <w:t>userstories</w:t>
+      </w:r>
+      <w:proofErr w:type="spellEnd"/>
+      <w:r>
+        <w:t xml:space="preserve"> een compleet design maken. Hiermee kan ik vervolgens de structuur van de database maken aangezien ik </w:t>
+      </w:r>
+      <w:r>
+        <w:t>de meeste functionaliteit dan al in zicht heb.</w:t>
+      </w:r>
+    </w:p>
+    <w:p/>
+    <w:p>
+      <w:r>
+        <w:t xml:space="preserve">Nu ik een basis van </w:t>
+      </w:r>
+      <w:r>
+        <w:t>het</w:t>
+      </w:r>
+      <w:r>
+        <w:t xml:space="preserve"> design heb</w:t>
+      </w:r>
+      <w:r>
+        <w:t>, kan ik alvast beginnen met het maken van de header</w:t>
+      </w:r>
+      <w:r>
+        <w:t>. Dit</w:t>
       </w:r>
     </w:p>
     <w:sectPr>

</xml_diff>